<commit_message>
Improvements for Markdown to DOCX
</commit_message>
<xml_diff>
--- a/src/DocSharp.Markdown/Docx/Resources/markdown-template.docx
+++ b/src/DocSharp.Markdown/Docx/Resources/markdown-template.docx
@@ -1,18 +1,13 @@
 
 <file path=word/document.xml><?xml version="1.0" encoding="utf-8"?>
-<w:document xmlns:wpc="http://schemas.microsoft.com/office/word/2010/wordprocessingCanvas" xmlns:cx="http://schemas.microsoft.com/office/drawing/2014/chartex" xmlns:cx1="http://schemas.microsoft.com/office/drawing/2015/9/8/chartex" xmlns:mc="http://schemas.openxmlformats.org/markup-compatibility/2006" xmlns:o="urn:schemas-microsoft-com:office:office" xmlns:r="http://schemas.openxmlformats.org/officeDocument/2006/relationships" xmlns:m="http://schemas.openxmlformats.org/officeDocument/2006/math" xmlns:v="urn:schemas-microsoft-com:vml" xmlns:wp14="http://schemas.microsoft.com/office/word/2010/wordprocessingDrawing" xmlns:wp="http://schemas.openxmlformats.org/drawingml/2006/wordprocessingDrawing" xmlns:w10="urn:schemas-microsoft-com:office:word" xmlns:w="http://schemas.openxmlformats.org/wordprocessingml/2006/main" xmlns:w14="http://schemas.microsoft.com/office/word/2010/wordml" xmlns:w15="http://schemas.microsoft.com/office/word/2012/wordml" xmlns:w16se="http://schemas.microsoft.com/office/word/2015/wordml/symex" xmlns:wpg="http://schemas.microsoft.com/office/word/2010/wordprocessingGroup" xmlns:wpi="http://schemas.microsoft.com/office/word/2010/wordprocessingInk" xmlns:wne="http://schemas.microsoft.com/office/word/2006/wordml" xmlns:wps="http://schemas.microsoft.com/office/word/2010/wordprocessingShape" mc:Ignorable="w14 w15 w16se wp14">
+<w:document xmlns:wpc="http://schemas.microsoft.com/office/word/2010/wordprocessingCanvas" xmlns:cx="http://schemas.microsoft.com/office/drawing/2014/chartex" xmlns:cx1="http://schemas.microsoft.com/office/drawing/2015/9/8/chartex" xmlns:cx2="http://schemas.microsoft.com/office/drawing/2015/10/21/chartex" xmlns:cx3="http://schemas.microsoft.com/office/drawing/2016/5/9/chartex" xmlns:cx4="http://schemas.microsoft.com/office/drawing/2016/5/10/chartex" xmlns:cx5="http://schemas.microsoft.com/office/drawing/2016/5/11/chartex" xmlns:cx6="http://schemas.microsoft.com/office/drawing/2016/5/12/chartex" xmlns:cx7="http://schemas.microsoft.com/office/drawing/2016/5/13/chartex" xmlns:cx8="http://schemas.microsoft.com/office/drawing/2016/5/14/chartex" xmlns:mc="http://schemas.openxmlformats.org/markup-compatibility/2006" xmlns:aink="http://schemas.microsoft.com/office/drawing/2016/ink" xmlns:am3d="http://schemas.microsoft.com/office/drawing/2017/model3d" xmlns:o="urn:schemas-microsoft-com:office:office" xmlns:oel="http://schemas.microsoft.com/office/2019/extlst" xmlns:r="http://schemas.openxmlformats.org/officeDocument/2006/relationships" xmlns:m="http://schemas.openxmlformats.org/officeDocument/2006/math" xmlns:v="urn:schemas-microsoft-com:vml" xmlns:wp14="http://schemas.microsoft.com/office/word/2010/wordprocessingDrawing" xmlns:wp="http://schemas.openxmlformats.org/drawingml/2006/wordprocessingDrawing" xmlns:w10="urn:schemas-microsoft-com:office:word" xmlns:w="http://schemas.openxmlformats.org/wordprocessingml/2006/main" xmlns:w14="http://schemas.microsoft.com/office/word/2010/wordml" xmlns:w15="http://schemas.microsoft.com/office/word/2012/wordml" xmlns:w16cex="http://schemas.microsoft.com/office/word/2018/wordml/cex" xmlns:w16cid="http://schemas.microsoft.com/office/word/2016/wordml/cid" xmlns:w16="http://schemas.microsoft.com/office/word/2018/wordml" xmlns:w16du="http://schemas.microsoft.com/office/word/2023/wordml/word16du" xmlns:w16sdtdh="http://schemas.microsoft.com/office/word/2020/wordml/sdtdatahash" xmlns:w16se="http://schemas.microsoft.com/office/word/2015/wordml/symex" xmlns:wpg="http://schemas.microsoft.com/office/word/2010/wordprocessingGroup" xmlns:wpi="http://schemas.microsoft.com/office/word/2010/wordprocessingInk" xmlns:wne="http://schemas.microsoft.com/office/word/2006/wordml" xmlns:wps="http://schemas.microsoft.com/office/word/2010/wordprocessingShape" mc:Ignorable="w14 w15 w16se w16cid w16 w16cex w16sdtdh w16du wp14">
   <w:body>
     <w:p>
       <w:pPr>
-        <w:pStyle w:val="MDHeading1"/>
-      </w:pPr>
-      <w:proofErr w:type="spellStart"/>
-      <w:r>
-        <w:t>Markdig</w:t>
-      </w:r>
-      <w:proofErr w:type="spellEnd"/>
-      <w:r>
-        <w:t xml:space="preserve"> to DOCX Empty Document Template</w:t>
+        <w:pStyle w:val="MDHeading2"/>
+      </w:pPr>
+      <w:r>
+        <w:t>Markdig to DOCX Empty Document Template</w:t>
       </w:r>
     </w:p>
     <w:p>
@@ -20,23 +15,7 @@
         <w:pStyle w:val="MDParagraphTextBody"/>
       </w:pPr>
       <w:r>
-        <w:t xml:space="preserve">This document </w:t>
-      </w:r>
-      <w:proofErr w:type="gramStart"/>
-      <w:r>
-        <w:t>is used</w:t>
-      </w:r>
-      <w:proofErr w:type="gramEnd"/>
-      <w:r>
-        <w:t xml:space="preserve"> to generate an empty document template for the </w:t>
-      </w:r>
-      <w:proofErr w:type="spellStart"/>
-      <w:r>
-        <w:t>docx</w:t>
-      </w:r>
-      <w:proofErr w:type="spellEnd"/>
-      <w:r>
-        <w:t xml:space="preserve"> conversion.</w:t>
+        <w:t>This document is used to generate an empty document template for the docx conversion.</w:t>
       </w:r>
     </w:p>
     <w:p>
@@ -44,15 +23,7 @@
         <w:pStyle w:val="MDParagraphTextBody"/>
       </w:pPr>
       <w:r>
-        <w:t xml:space="preserve">The page content </w:t>
-      </w:r>
-      <w:proofErr w:type="gramStart"/>
-      <w:r>
-        <w:t>is ignored and only used to show/modify all the styles used by the markdown conversion process</w:t>
-      </w:r>
-      <w:proofErr w:type="gramEnd"/>
-      <w:r>
-        <w:t>.</w:t>
+        <w:t>The page content is ignored and only used to show/modify all the styles used by the markdown conversion process.</w:t>
       </w:r>
     </w:p>
     <w:p>
@@ -60,15 +31,7 @@
         <w:pStyle w:val="MDParagraphTextBody"/>
       </w:pPr>
       <w:r>
-        <w:t xml:space="preserve">All styles </w:t>
-      </w:r>
-      <w:proofErr w:type="gramStart"/>
-      <w:r>
-        <w:t>are based</w:t>
-      </w:r>
-      <w:proofErr w:type="gramEnd"/>
-      <w:r>
-        <w:t xml:space="preserve"> on </w:t>
+        <w:t xml:space="preserve">All styles are based on </w:t>
       </w:r>
       <w:r>
         <w:rPr>
@@ -77,15 +40,7 @@
         <w:t>MD Normal</w:t>
       </w:r>
       <w:r>
-        <w:t xml:space="preserve"> – use it to change font / paragraph properties </w:t>
-      </w:r>
-      <w:proofErr w:type="spellStart"/>
-      <w:r>
-        <w:t>globablly</w:t>
-      </w:r>
-      <w:proofErr w:type="spellEnd"/>
-      <w:r>
-        <w:t>.</w:t>
+        <w:t xml:space="preserve"> – use it to change font / paragraph properties globablly.</w:t>
       </w:r>
     </w:p>
     <w:p>
@@ -93,15 +48,7 @@
         <w:pStyle w:val="MDParagraphTextBody"/>
       </w:pPr>
       <w:r>
-        <w:t xml:space="preserve">Normal paragraphs </w:t>
-      </w:r>
-      <w:proofErr w:type="gramStart"/>
-      <w:r>
-        <w:t>are rendered</w:t>
-      </w:r>
-      <w:proofErr w:type="gramEnd"/>
-      <w:r>
-        <w:t xml:space="preserve"> using </w:t>
+        <w:t xml:space="preserve">Normal paragraphs are rendered using </w:t>
       </w:r>
       <w:r>
         <w:rPr>
@@ -190,15 +137,7 @@
         <w:t>MD Horizontal Line</w:t>
       </w:r>
       <w:r>
-        <w:t xml:space="preserve"> style </w:t>
-      </w:r>
-      <w:proofErr w:type="gramStart"/>
-      <w:r>
-        <w:t>is used</w:t>
-      </w:r>
-      <w:proofErr w:type="gramEnd"/>
-      <w:r>
-        <w:t xml:space="preserve"> to generate a horizontal line.</w:t>
+        <w:t xml:space="preserve"> style is used to generate a horizontal line.</w:t>
       </w:r>
     </w:p>
     <w:p>
@@ -553,9 +492,7 @@
       <w:r>
         <w:t>Sub-item</w:t>
       </w:r>
-      <w:bookmarkStart w:id="0" w:name="_GoBack"/>
-    </w:p>
-    <w:bookmarkEnd w:id="0"/>
+    </w:p>
     <w:p>
       <w:pPr>
         <w:pStyle w:val="MDListBulletItem"/>
@@ -584,7 +521,7 @@
 </file>
 
 <file path=word/numbering.xml><?xml version="1.0" encoding="utf-8"?>
-<w:numbering xmlns:wpc="http://schemas.microsoft.com/office/word/2010/wordprocessingCanvas" xmlns:cx="http://schemas.microsoft.com/office/drawing/2014/chartex" xmlns:cx1="http://schemas.microsoft.com/office/drawing/2015/9/8/chartex" xmlns:mc="http://schemas.openxmlformats.org/markup-compatibility/2006" xmlns:o="urn:schemas-microsoft-com:office:office" xmlns:r="http://schemas.openxmlformats.org/officeDocument/2006/relationships" xmlns:m="http://schemas.openxmlformats.org/officeDocument/2006/math" xmlns:v="urn:schemas-microsoft-com:vml" xmlns:wp14="http://schemas.microsoft.com/office/word/2010/wordprocessingDrawing" xmlns:wp="http://schemas.openxmlformats.org/drawingml/2006/wordprocessingDrawing" xmlns:w10="urn:schemas-microsoft-com:office:word" xmlns:w="http://schemas.openxmlformats.org/wordprocessingml/2006/main" xmlns:w14="http://schemas.microsoft.com/office/word/2010/wordml" xmlns:w15="http://schemas.microsoft.com/office/word/2012/wordml" xmlns:w16se="http://schemas.microsoft.com/office/word/2015/wordml/symex" xmlns:wpg="http://schemas.microsoft.com/office/word/2010/wordprocessingGroup" xmlns:wpi="http://schemas.microsoft.com/office/word/2010/wordprocessingInk" xmlns:wne="http://schemas.microsoft.com/office/word/2006/wordml" xmlns:wps="http://schemas.microsoft.com/office/word/2010/wordprocessingShape" mc:Ignorable="w14 w15 w16se wp14">
+<w:numbering xmlns:wpc="http://schemas.microsoft.com/office/word/2010/wordprocessingCanvas" xmlns:cx="http://schemas.microsoft.com/office/drawing/2014/chartex" xmlns:cx1="http://schemas.microsoft.com/office/drawing/2015/9/8/chartex" xmlns:cx2="http://schemas.microsoft.com/office/drawing/2015/10/21/chartex" xmlns:cx3="http://schemas.microsoft.com/office/drawing/2016/5/9/chartex" xmlns:cx4="http://schemas.microsoft.com/office/drawing/2016/5/10/chartex" xmlns:cx5="http://schemas.microsoft.com/office/drawing/2016/5/11/chartex" xmlns:cx6="http://schemas.microsoft.com/office/drawing/2016/5/12/chartex" xmlns:cx7="http://schemas.microsoft.com/office/drawing/2016/5/13/chartex" xmlns:cx8="http://schemas.microsoft.com/office/drawing/2016/5/14/chartex" xmlns:mc="http://schemas.openxmlformats.org/markup-compatibility/2006" xmlns:aink="http://schemas.microsoft.com/office/drawing/2016/ink" xmlns:am3d="http://schemas.microsoft.com/office/drawing/2017/model3d" xmlns:o="urn:schemas-microsoft-com:office:office" xmlns:oel="http://schemas.microsoft.com/office/2019/extlst" xmlns:r="http://schemas.openxmlformats.org/officeDocument/2006/relationships" xmlns:m="http://schemas.openxmlformats.org/officeDocument/2006/math" xmlns:v="urn:schemas-microsoft-com:vml" xmlns:wp14="http://schemas.microsoft.com/office/word/2010/wordprocessingDrawing" xmlns:wp="http://schemas.openxmlformats.org/drawingml/2006/wordprocessingDrawing" xmlns:w10="urn:schemas-microsoft-com:office:word" xmlns:w="http://schemas.openxmlformats.org/wordprocessingml/2006/main" xmlns:w14="http://schemas.microsoft.com/office/word/2010/wordml" xmlns:w15="http://schemas.microsoft.com/office/word/2012/wordml" xmlns:w16cex="http://schemas.microsoft.com/office/word/2018/wordml/cex" xmlns:w16cid="http://schemas.microsoft.com/office/word/2016/wordml/cid" xmlns:w16="http://schemas.microsoft.com/office/word/2018/wordml" xmlns:w16du="http://schemas.microsoft.com/office/word/2023/wordml/word16du" xmlns:w16sdtdh="http://schemas.microsoft.com/office/word/2020/wordml/sdtdatahash" xmlns:w16se="http://schemas.microsoft.com/office/word/2015/wordml/symex" xmlns:wpg="http://schemas.microsoft.com/office/word/2010/wordprocessingGroup" xmlns:wpi="http://schemas.microsoft.com/office/word/2010/wordprocessingInk" xmlns:wne="http://schemas.microsoft.com/office/word/2006/wordml" xmlns:wps="http://schemas.microsoft.com/office/word/2010/wordprocessingShape" mc:Ignorable="w14 w15 w16se w16cid w16 w16cex w16sdtdh w16du wp14">
   <w:abstractNum w:abstractNumId="0" w15:restartNumberingAfterBreak="0">
     <w:nsid w:val="08E725AA"/>
     <w:multiLevelType w:val="multilevel"/>
@@ -709,7 +646,7 @@
       </w:rPr>
     </w:lvl>
   </w:abstractNum>
-  <w:abstractNum w:abstractNumId="2" w15:restartNumberingAfterBreak="0">
+  <w:abstractNum w:abstractNumId="1" w15:restartNumberingAfterBreak="0">
     <w:nsid w:val="350652A1"/>
     <w:multiLevelType w:val="multilevel"/>
     <w:tmpl w:val="79D20016"/>
@@ -824,35 +761,35 @@
       </w:rPr>
     </w:lvl>
   </w:abstractNum>
-  <w:num w:numId="1">
-    <w:abstractNumId w:val="2"/>
+  <w:num w:numId="1" w16cid:durableId="1692946925">
+    <w:abstractNumId w:val="1"/>
   </w:num>
-  <w:num w:numId="2">
-    <w:abstractNumId w:val="2"/>
+  <w:num w:numId="2" w16cid:durableId="616061761">
+    <w:abstractNumId w:val="1"/>
   </w:num>
-  <w:num w:numId="3">
-    <w:abstractNumId w:val="2"/>
+  <w:num w:numId="3" w16cid:durableId="1428042359">
+    <w:abstractNumId w:val="1"/>
   </w:num>
-  <w:num w:numId="4">
-    <w:abstractNumId w:val="2"/>
+  <w:num w:numId="4" w16cid:durableId="1289317150">
+    <w:abstractNumId w:val="1"/>
   </w:num>
-  <w:num w:numId="5">
+  <w:num w:numId="5" w16cid:durableId="1698656209">
     <w:abstractNumId w:val="0"/>
   </w:num>
-  <w:num w:numId="6">
+  <w:num w:numId="6" w16cid:durableId="1324622159">
     <w:abstractNumId w:val="0"/>
   </w:num>
-  <w:num w:numId="7">
+  <w:num w:numId="7" w16cid:durableId="938294960">
     <w:abstractNumId w:val="0"/>
   </w:num>
-  <w:num w:numId="8">
+  <w:num w:numId="8" w16cid:durableId="377781821">
     <w:abstractNumId w:val="0"/>
   </w:num>
 </w:numbering>
 </file>
 
 <file path=word/styles.xml><?xml version="1.0" encoding="utf-8"?>
-<w:styles xmlns:mc="http://schemas.openxmlformats.org/markup-compatibility/2006" xmlns:r="http://schemas.openxmlformats.org/officeDocument/2006/relationships" xmlns:w="http://schemas.openxmlformats.org/wordprocessingml/2006/main" xmlns:w14="http://schemas.microsoft.com/office/word/2010/wordml" xmlns:w15="http://schemas.microsoft.com/office/word/2012/wordml" xmlns:w16se="http://schemas.microsoft.com/office/word/2015/wordml/symex" mc:Ignorable="w14 w15 w16se">
+<w:styles xmlns:mc="http://schemas.openxmlformats.org/markup-compatibility/2006" xmlns:r="http://schemas.openxmlformats.org/officeDocument/2006/relationships" xmlns:w="http://schemas.openxmlformats.org/wordprocessingml/2006/main" xmlns:w14="http://schemas.microsoft.com/office/word/2010/wordml" xmlns:w15="http://schemas.microsoft.com/office/word/2012/wordml" xmlns:w16cex="http://schemas.microsoft.com/office/word/2018/wordml/cex" xmlns:w16cid="http://schemas.microsoft.com/office/word/2016/wordml/cid" xmlns:w16="http://schemas.microsoft.com/office/word/2018/wordml" xmlns:w16du="http://schemas.microsoft.com/office/word/2023/wordml/word16du" xmlns:w16sdtdh="http://schemas.microsoft.com/office/word/2020/wordml/sdtdatahash" xmlns:w16se="http://schemas.microsoft.com/office/word/2015/wordml/symex" mc:Ignorable="w14 w15 w16se w16cid w16 w16cex w16sdtdh w16du">
   <w:docDefaults>
     <w:rPrDefault>
       <w:rPr>
@@ -868,7 +805,7 @@
       </w:pPr>
     </w:pPrDefault>
   </w:docDefaults>
-  <w:latentStyles w:defLockedState="0" w:defUIPriority="99" w:defSemiHidden="0" w:defUnhideWhenUsed="0" w:defQFormat="0" w:count="371">
+  <w:latentStyles w:defLockedState="0" w:defUIPriority="99" w:defSemiHidden="0" w:defUnhideWhenUsed="0" w:defQFormat="0" w:count="376">
     <w:lsdException w:name="Normal" w:uiPriority="0" w:qFormat="1"/>
     <w:lsdException w:name="heading 1" w:uiPriority="9" w:qFormat="1"/>
     <w:lsdException w:name="heading 2" w:semiHidden="1" w:uiPriority="9" w:unhideWhenUsed="1" w:qFormat="1"/>
@@ -1240,19 +1177,24 @@
     <w:lsdException w:name="List Table 5 Dark Accent 6" w:uiPriority="50"/>
     <w:lsdException w:name="List Table 6 Colorful Accent 6" w:uiPriority="51"/>
     <w:lsdException w:name="List Table 7 Colorful Accent 6" w:uiPriority="52"/>
+    <w:lsdException w:name="Mention" w:semiHidden="1" w:unhideWhenUsed="1"/>
+    <w:lsdException w:name="Smart Hyperlink" w:semiHidden="1" w:unhideWhenUsed="1"/>
+    <w:lsdException w:name="Hashtag" w:semiHidden="1" w:unhideWhenUsed="1"/>
+    <w:lsdException w:name="Unresolved Mention" w:semiHidden="1" w:unhideWhenUsed="1"/>
+    <w:lsdException w:name="Smart Link" w:semiHidden="1" w:unhideWhenUsed="1"/>
   </w:latentStyles>
-  <w:style w:type="paragraph" w:default="1" w:styleId="a">
+  <w:style w:type="paragraph" w:default="1" w:styleId="Normale">
     <w:name w:val="Normal"/>
     <w:qFormat/>
     <w:rsid w:val="007F5F51"/>
   </w:style>
-  <w:style w:type="character" w:default="1" w:styleId="a0">
+  <w:style w:type="character" w:default="1" w:styleId="Carpredefinitoparagrafo">
     <w:name w:val="Default Paragraph Font"/>
     <w:uiPriority w:val="1"/>
     <w:semiHidden/>
     <w:unhideWhenUsed/>
   </w:style>
-  <w:style w:type="table" w:default="1" w:styleId="a1">
+  <w:style w:type="table" w:default="1" w:styleId="Tabellanormale">
     <w:name w:val="Normal Table"/>
     <w:uiPriority w:val="99"/>
     <w:semiHidden/>
@@ -1267,7 +1209,7 @@
       </w:tblCellMar>
     </w:tblPr>
   </w:style>
-  <w:style w:type="numbering" w:default="1" w:styleId="a2">
+  <w:style w:type="numbering" w:default="1" w:styleId="Nessunelenco">
     <w:name w:val="No List"/>
     <w:uiPriority w:val="99"/>
     <w:semiHidden/>
@@ -1329,7 +1271,7 @@
   </w:style>
   <w:style w:type="character" w:customStyle="1" w:styleId="MDNormal0">
     <w:name w:val="MD Normal Знак"/>
-    <w:basedOn w:val="a0"/>
+    <w:basedOn w:val="Carpredefinitoparagrafo"/>
     <w:link w:val="MDNormal"/>
     <w:rsid w:val="00C76B6A"/>
     <w:rPr>
@@ -1351,15 +1293,10 @@
   <w:style w:type="paragraph" w:customStyle="1" w:styleId="MDHeading2">
     <w:name w:val="MD Heading 2"/>
     <w:basedOn w:val="MDHeading"/>
-    <w:next w:val="a"/>
+    <w:next w:val="Normale"/>
     <w:link w:val="MDHeading20"/>
     <w:qFormat/>
-    <w:rsid w:val="00DB51A0"/>
-    <w:pPr>
-      <w:pBdr>
-        <w:bottom w:val="single" w:sz="4" w:space="1" w:color="auto"/>
-      </w:pBdr>
-    </w:pPr>
+    <w:rsid w:val="00B149AE"/>
     <w:rPr>
       <w:sz w:val="42"/>
     </w:rPr>
@@ -1368,7 +1305,7 @@
     <w:name w:val="MD Heading 2 Знак"/>
     <w:basedOn w:val="MDHeading0"/>
     <w:link w:val="MDHeading2"/>
-    <w:rsid w:val="00DB51A0"/>
+    <w:rsid w:val="00B149AE"/>
     <w:rPr>
       <w:b/>
       <w:sz w:val="42"/>
@@ -1543,9 +1480,9 @@
       <w:lang w:val="en-US"/>
     </w:rPr>
   </w:style>
-  <w:style w:type="character" w:styleId="a3">
+  <w:style w:type="character" w:styleId="Collegamentoipertestuale">
     <w:name w:val="Hyperlink"/>
-    <w:basedOn w:val="a0"/>
+    <w:basedOn w:val="Carpredefinitoparagrafo"/>
     <w:uiPriority w:val="99"/>
     <w:unhideWhenUsed/>
     <w:rsid w:val="00855226"/>
@@ -1566,7 +1503,7 @@
   </w:style>
   <w:style w:type="character" w:customStyle="1" w:styleId="MDHyperlink">
     <w:name w:val="MD Hyperlink"/>
-    <w:basedOn w:val="a0"/>
+    <w:basedOn w:val="Carpredefinitoparagrafo"/>
     <w:uiPriority w:val="1"/>
     <w:qFormat/>
     <w:rsid w:val="00855226"/>

</xml_diff>